<commit_message>
Refine CS 499 ePortfolio wording
</commit_message>
<xml_diff>
--- a/artifacts/databases/enhanced/CS340_Project_Two_README_Shaban_Ghaith.docx
+++ b/artifacts/databases/enhanced/CS340_Project_Two_README_Shaban_Ghaith.docx
@@ -80,7 +80,7 @@
         <w:rPr>
           <w:b w:val="0"/>
         </w:rPr>
-        <w:t>For this project, I completed a client/server dashboard for Grazioso Salvare. The dashboard connects to the Austin Animal Center Outcomes data through my AnimalShelter CRUD module, displays the records in an interactive table, and lets the user filter rescue candidates by the three required rescue categories. When a filter is selected, the data table, breed chart, and geolocation map all update together.</w:t>
+        <w:t>For this project, I completed a client/server dashboard for Grazioso Salvare. The dashboard connects to the Austin Animal Center Outcomes data through my AnimalShelter CRUD module, displays the records in an interactive table and lets the user filter rescue candidates by the three required rescue categories. When a filter is selected, the data table, breed chart and geolocation map all update together.</w:t>
       </w:r>
     </w:p>
     <w:p>
@@ -88,7 +88,7 @@
         <w:pStyle w:val="ListBullet"/>
       </w:pPr>
       <w:r>
-        <w:t>Water Rescue filters for dogs matching preferred water-rescue breeds, intact female sex, and training age from 26 to 156 weeks.</w:t>
+        <w:t>Water Rescue filters for dogs matching preferred water-rescue breeds, intact female sex and training age from 26 to 156 weeks.</w:t>
       </w:r>
     </w:p>
     <w:p>
@@ -96,7 +96,7 @@
         <w:pStyle w:val="ListBullet"/>
       </w:pPr>
       <w:r>
-        <w:t>Mountain or Wilderness Rescue filters for preferred mountain/wilderness breeds, intact male sex, and training age from 26 to 156 weeks.</w:t>
+        <w:t>Mountain or Wilderness Rescue filters for preferred mountain/wilderness breeds, intact male sex and training age from 26 to 156 weeks.</w:t>
       </w:r>
     </w:p>
     <w:p>
@@ -104,7 +104,7 @@
         <w:pStyle w:val="ListBullet"/>
       </w:pPr>
       <w:r>
-        <w:t>Disaster or Individual Tracking filters for preferred tracking breeds, intact male sex, and training age from 20 to 300 weeks.</w:t>
+        <w:t>Disaster or Individual Tracking filters for preferred tracking breeds, intact male sex and training age from 20 to 300 weeks.</w:t>
       </w:r>
     </w:p>
     <w:p>
@@ -288,7 +288,7 @@
           </w:tcPr>
           <w:p>
             <w:r>
-              <w:t>MongoDB works well as the model layer because the animal records are document-style data. It stores flexible JSON-like documents, supports direct query filters, and works smoothly with Python through PyMongo.</w:t>
+              <w:t>MongoDB works well as the model layer because the animal records are document-style data. It stores flexible JSON-like documents, supports direct query filters and works smoothly with Python through PyMongo.</w:t>
             </w:r>
           </w:p>
         </w:tc>
@@ -354,7 +354,7 @@
           </w:tcPr>
           <w:p>
             <w:r>
-              <w:t>Dash provides the web application view and controller structure. The layout defines the view widgets, and callbacks work as the controller by reacting to filter changes and updating the table/charts.</w:t>
+              <w:t>Dash provides the web application view and controller structure. The layout defines the view widgets and callbacks work as the controller by reacting to filter changes and updating the table/charts.</w:t>
             </w:r>
           </w:p>
         </w:tc>
@@ -501,7 +501,7 @@
         <w:pStyle w:val="ListNumber"/>
       </w:pPr>
       <w:r>
-        <w:t>I reviewed the dashboard specifications document and identified the required filters, table, geolocation chart, second chart, logo, and unique identifier requirements.</w:t>
+        <w:t>I reviewed the dashboard specifications document and identified the required filters, table, geolocation chart, second chart, logo and unique identifier requirements.</w:t>
       </w:r>
     </w:p>
     <w:p>
@@ -517,7 +517,7 @@
         <w:pStyle w:val="ListNumber"/>
       </w:pPr>
       <w:r>
-        <w:t>I built MongoDB queries for the three rescue categories using animal type, breed, sex, and age_upon_outcome_in_weeks.</w:t>
+        <w:t>I built MongoDB queries for the three rescue categories using animal type, breed, sex and age_upon_outcome_in_weeks.</w:t>
       </w:r>
     </w:p>
     <w:p>
@@ -525,7 +525,7 @@
         <w:pStyle w:val="ListNumber"/>
       </w:pPr>
       <w:r>
-        <w:t>I completed the ProjectTwoDashboard.ipynb layout with the Grazioso Salvare logo, my name, radio button filters, interactive Dash DataTable, Plotly pie chart, and dash-leaflet map.</w:t>
+        <w:t>I completed the ProjectTwoDashboard.ipynb layout with the Grazioso Salvare logo, my name, radio button filters, interactive Dash DataTable, Plotly pie chart and dash-leaflet map.</w:t>
       </w:r>
     </w:p>
     <w:p>
@@ -533,7 +533,7 @@
         <w:pStyle w:val="ListNumber"/>
       </w:pPr>
       <w:r>
-        <w:t>I connected the widgets with Dash callbacks so changing the rescue filter updates the table, chart, record count, and map.</w:t>
+        <w:t>I connected the widgets with Dash callbacks so changing the rescue filter updates the table, chart, record count and map.</w:t>
       </w:r>
     </w:p>
     <w:p>
@@ -568,7 +568,7 @@
         <w:pStyle w:val="ListNumber"/>
       </w:pPr>
       <w:r>
-        <w:t>Open the project folder that contains ProjectTwoDashboard.ipynb, animal_shelter.py, Grazioso Salvare Logo.png, and aac_shelter_outcomes.csv.</w:t>
+        <w:t>Open the project folder that contains ProjectTwoDashboard.ipynb, animal_shelter.py, Grazioso Salvare Logo.png and aac_shelter_outcomes.csv.</w:t>
       </w:r>
     </w:p>
     <w:p>
@@ -592,7 +592,7 @@
         <w:pStyle w:val="ListNumber"/>
       </w:pPr>
       <w:r>
-        <w:t>Install the needed Python packages if they are not already available: dash, jupyter-dash, dash-leaflet, pandas, plotly, pymongo, matplotlib, and numpy.</w:t>
+        <w:t>Install the needed Python packages if they are not already available: dash, jupyter-dash, dash-leaflet, pandas, plotly, pymongo, matplotlib and numpy.</w:t>
       </w:r>
     </w:p>
     <w:p>
@@ -616,7 +616,7 @@
         <w:pStyle w:val="ListNumber"/>
       </w:pPr>
       <w:r>
-        <w:t>Use the radio buttons to test Reset, Water Rescue, Mountain or Wilderness Rescue, and Disaster or Individual Tracking.</w:t>
+        <w:t>Use the radio buttons to test Reset, Water Rescue, Mountain or Wilderness Rescue and Disaster or Individual Tracking.</w:t>
       </w:r>
     </w:p>
     <w:p>
@@ -713,7 +713,7 @@
         <w:rPr>
           <w:b w:val="0"/>
         </w:rPr>
-        <w:t>I used generative AI as a support tool to help organize the README wording and check the project structure. I reviewed the code, requirements, and final files before submission.</w:t>
+        <w:t>I used generative AI as a support tool to help organize the README wording and check the project structure. I reviewed the code, requirements and final files before submission.</w:t>
       </w:r>
     </w:p>
     <w:sectPr>

</xml_diff>